<commit_message>
Removed leading 'the', added temporary ability to bulk generate
</commit_message>
<xml_diff>
--- a/_out/mdl/2023/MDL-CITY_OF_DECATUR-376001308-2023.docx
+++ b/_out/mdl/2023/MDL-CITY_OF_DECATUR-376001308-2023.docx
@@ -33,7 +33,7 @@
           <w:smallCaps w:val="0"/>
           <w:sz w:val="24"/>
         </w:rPr>
-        <w:t>January 12, 2026</w:t>
+        <w:t>March 04, 2026</w:t>
       </w:r>
     </w:p>
     <w:p>
@@ -73,7 +73,7 @@
           <w:smallCaps w:val="0"/>
           <w:sz w:val="24"/>
         </w:rPr>
-        <w:t>City Of Decatur</w:t>
+        <w:t>City of Decatur</w:t>
       </w:r>
     </w:p>
     <w:bookmarkEnd w:id="2"/>
@@ -120,7 +120,7 @@
           <w:smallCaps w:val="0"/>
           <w:sz w:val="24"/>
         </w:rPr>
-        <w:t>301 East Huron</w:t>
+        <w:t>#1 Gary K Anderson Plaza</w:t>
       </w:r>
     </w:p>
     <w:p>
@@ -142,7 +142,7 @@
           <w:smallCaps w:val="0"/>
           <w:sz w:val="24"/>
         </w:rPr>
-        <w:t>Ann Arbor, MI 48107</w:t>
+        <w:t>Decatur, IL 62523</w:t>
       </w:r>
     </w:p>
     <w:p>
@@ -164,7 +164,7 @@
           <w:smallCaps w:val="0"/>
           <w:sz w:val="24"/>
         </w:rPr>
-        <w:t>Attention: Marti Praschan, Chief Financial Officer</w:t>
+        <w:t>Attention: Ruby James, Cfo and City Treasurer</w:t>
       </w:r>
     </w:p>
     <w:p>
@@ -223,237 +223,9 @@
       </w:pPr>
       <w:r>
         <w:rPr>
-          <w:caps w:val="0"/>
-          <w:smallCaps w:val="0"/>
-          <w:sz w:val="24"/>
-          <w:szCs w:val="24"/>
-        </w:rPr>
-        <w:t>In accordance with 2 C.F.R. § 200.521</w:t>
-      </w:r>
-      <w:r>
-        <w:rPr>
-          <w:caps w:val="0"/>
-          <w:smallCaps w:val="0"/>
-          <w:sz w:val="24"/>
-          <w:szCs w:val="24"/>
-        </w:rPr>
-        <w:t>(b)</w:t>
-      </w:r>
-      <w:r>
-        <w:rPr>
-          <w:caps w:val="0"/>
-          <w:smallCaps w:val="0"/>
-          <w:sz w:val="24"/>
-          <w:szCs w:val="24"/>
-        </w:rPr>
-        <w:t xml:space="preserve">, the U.S. Department of the Treasury (Treasury) is required to issue a management decision </w:t>
-      </w:r>
-      <w:r>
-        <w:rPr>
-          <w:caps w:val="0"/>
-          <w:smallCaps w:val="0"/>
-          <w:sz w:val="24"/>
-          <w:szCs w:val="24"/>
-        </w:rPr>
-        <w:t>for</w:t>
-      </w:r>
-      <w:r>
-        <w:rPr>
-          <w:caps w:val="0"/>
-          <w:smallCaps w:val="0"/>
-          <w:sz w:val="24"/>
-          <w:szCs w:val="24"/>
-        </w:rPr>
-        <w:t xml:space="preserve"> </w:t>
-      </w:r>
-      <w:r>
-        <w:rPr>
-          <w:caps w:val="0"/>
-          <w:smallCaps w:val="0"/>
-          <w:sz w:val="24"/>
-          <w:szCs w:val="24"/>
-        </w:rPr>
-        <w:t xml:space="preserve">single </w:t>
-      </w:r>
-      <w:r>
-        <w:rPr>
-          <w:caps w:val="0"/>
-          <w:smallCaps w:val="0"/>
-          <w:sz w:val="24"/>
-          <w:szCs w:val="24"/>
-        </w:rPr>
-        <w:t>audit findings pertaining to award</w:t>
-      </w:r>
-      <w:r>
-        <w:rPr>
-          <w:caps w:val="0"/>
-          <w:smallCaps w:val="0"/>
-          <w:sz w:val="24"/>
-          <w:szCs w:val="24"/>
-        </w:rPr>
-        <w:t>s</w:t>
-      </w:r>
-      <w:r>
-        <w:rPr>
-          <w:caps w:val="0"/>
-          <w:smallCaps w:val="0"/>
-          <w:sz w:val="24"/>
-          <w:szCs w:val="24"/>
-        </w:rPr>
-        <w:t xml:space="preserve"> under Treasury</w:t>
-      </w:r>
-      <w:r>
-        <w:rPr>
-          <w:caps w:val="0"/>
-          <w:smallCaps w:val="0"/>
-          <w:sz w:val="24"/>
-          <w:szCs w:val="24"/>
-        </w:rPr>
-        <w:t>’s</w:t>
-      </w:r>
-      <w:r>
-        <w:rPr>
-          <w:caps w:val="0"/>
-          <w:smallCaps w:val="0"/>
-          <w:sz w:val="24"/>
-          <w:szCs w:val="24"/>
-        </w:rPr>
-        <w:t xml:space="preserve"> programs.</w:t>
-      </w:r>
-      <w:r>
-        <w:rPr>
-          <w:caps w:val="0"/>
-          <w:smallCaps w:val="0"/>
-          <w:sz w:val="24"/>
-          <w:szCs w:val="24"/>
-        </w:rPr>
-        <w:t xml:space="preserve"> </w:t>
-      </w:r>
-      <w:r>
-        <w:rPr>
-          <w:caps w:val="0"/>
-          <w:smallCaps w:val="0"/>
-          <w:sz w:val="24"/>
-          <w:szCs w:val="24"/>
-        </w:rPr>
-        <w:t>Treasury</w:t>
-      </w:r>
-      <w:r>
-        <w:rPr>
-          <w:caps w:val="0"/>
-          <w:smallCaps w:val="0"/>
-          <w:sz w:val="24"/>
-          <w:szCs w:val="24"/>
-        </w:rPr>
-        <w:t>’s</w:t>
-      </w:r>
-      <w:r>
-        <w:rPr>
-          <w:caps w:val="0"/>
-          <w:smallCaps w:val="0"/>
-          <w:sz w:val="24"/>
-          <w:szCs w:val="24"/>
-        </w:rPr>
-        <w:t xml:space="preserve"> review as part of its responsibilities under 2 C.F.R § 200.513(c) includes an assessment of </w:t>
-      </w:r>
-      <w:r>
-        <w:rPr>
-          <w:caps w:val="0"/>
-          <w:smallCaps w:val="0"/>
-          <w:sz w:val="24"/>
-          <w:szCs w:val="24"/>
-        </w:rPr>
-        <w:t>Treasury</w:t>
-      </w:r>
-      <w:r>
-        <w:rPr>
-          <w:caps w:val="0"/>
-          <w:smallCaps w:val="0"/>
-          <w:sz w:val="24"/>
-          <w:szCs w:val="24"/>
-        </w:rPr>
-        <w:t xml:space="preserve">’s award </w:t>
-      </w:r>
-      <w:r>
-        <w:rPr>
-          <w:caps w:val="0"/>
-          <w:smallCaps w:val="0"/>
-          <w:sz w:val="24"/>
-          <w:szCs w:val="24"/>
-        </w:rPr>
-        <w:t>recipients</w:t>
-      </w:r>
-      <w:r>
-        <w:rPr>
-          <w:caps w:val="0"/>
-          <w:smallCaps w:val="0"/>
-          <w:sz w:val="24"/>
-          <w:szCs w:val="24"/>
-        </w:rPr>
-        <w:t>’</w:t>
-      </w:r>
-      <w:r>
-        <w:rPr>
-          <w:caps w:val="0"/>
-          <w:smallCaps w:val="0"/>
-          <w:sz w:val="24"/>
-          <w:szCs w:val="24"/>
-        </w:rPr>
-        <w:t xml:space="preserve"> </w:t>
-      </w:r>
-      <w:r>
-        <w:rPr>
-          <w:caps w:val="0"/>
-          <w:smallCaps w:val="0"/>
-          <w:sz w:val="24"/>
-          <w:szCs w:val="24"/>
-        </w:rPr>
-        <w:t xml:space="preserve">single </w:t>
-      </w:r>
-      <w:r>
-        <w:rPr>
-          <w:caps w:val="0"/>
-          <w:smallCaps w:val="0"/>
-          <w:sz w:val="24"/>
-          <w:szCs w:val="24"/>
-        </w:rPr>
-        <w:t>audit findings, corrective action plans</w:t>
-      </w:r>
-      <w:r>
-        <w:rPr>
-          <w:caps w:val="0"/>
-          <w:smallCaps w:val="0"/>
-          <w:sz w:val="24"/>
-          <w:szCs w:val="24"/>
-        </w:rPr>
-        <w:t xml:space="preserve"> (CAPs)</w:t>
-      </w:r>
-      <w:r>
-        <w:rPr>
-          <w:caps w:val="0"/>
-          <w:smallCaps w:val="0"/>
-          <w:sz w:val="24"/>
-          <w:szCs w:val="24"/>
-        </w:rPr>
-        <w:t>,</w:t>
-      </w:r>
-      <w:r>
-        <w:rPr>
-          <w:caps w:val="0"/>
-          <w:smallCaps w:val="0"/>
-          <w:sz w:val="24"/>
-          <w:szCs w:val="24"/>
-        </w:rPr>
-        <w:t xml:space="preserve"> and questioned costs, if any</w:t>
-      </w:r>
-      <w:r>
-        <w:rPr>
-          <w:caps w:val="0"/>
-          <w:smallCaps w:val="0"/>
-          <w:sz w:val="24"/>
-          <w:szCs w:val="24"/>
-        </w:rPr>
-        <w:t xml:space="preserve">.  </w:t>
+          <w:sz w:val="24"/>
+        </w:rPr>
+        <w:t xml:space="preserve">In accordance with 2 C.F.R. § 200.521(b), the U.S. Department of the Treasury (Treasury) is required to issue a management decision for single audit findings pertaining to awards under Treasury’s programs. Treasury’s review as part of its responsibilities under 2 C.F.R § 200.513(c) includes an assessment of Treasury’s award recipients’ single audit findings, corrective action plans (CAPs), and questioned costs, if any. </w:t>
       </w:r>
     </w:p>
     <w:p>
@@ -475,17 +247,45 @@
           <w:szCs w:val="24"/>
         </w:rPr>
       </w:pPr>
-      <w:r>
-        <w:t xml:space="preserve">Treasury has reviewed the single audit report for The </w:t>
+      <w:commentRangeStart w:id="16"/>
+      <w:commentRangeEnd w:id="16"/>
+      <w:bookmarkStart w:id="17" w:name="_Hlk154663119"/>
+      <w:commentRangeStart w:id="18"/>
+      <w:commentRangeStart w:id="19"/>
+      <w:commentRangeEnd w:id="18"/>
+      <w:commentRangeEnd w:id="19"/>
+      <w:bookmarkEnd w:id="17"/>
+      <w:r>
+        <w:rPr>
+          <w:sz w:val="24"/>
+        </w:rPr>
+        <w:t xml:space="preserve">Treasury has reviewed the single audit report for </w:t>
       </w:r>
       <w:r>
         <w:rPr>
           <w:b/>
-        </w:rPr>
-        <w:t>City Of Decatur</w:t>
-      </w:r>
-      <w:r>
-        <w:t xml:space="preserve"> prepared by the Sikich Cpa Llc for the fiscal year ending on June 30, 2023. No questioned costs are included in this single audit report. Treasury has made the following determinations regarding the audit finding(s) and CAP(s) listed below:</w:t>
+          <w:sz w:val="24"/>
+        </w:rPr>
+        <w:t>City of Decatur</w:t>
+      </w:r>
+      <w:r>
+        <w:rPr>
+          <w:sz w:val="24"/>
+        </w:rPr>
+        <w:t xml:space="preserve"> prepared by Sikich CPA LLC for the fiscal year ending on </w:t>
+      </w:r>
+      <w:r>
+        <w:rPr>
+          <w:b/>
+          <w:sz w:val="24"/>
+        </w:rPr>
+        <w:t>June 30, 2023</w:t>
+      </w:r>
+      <w:r>
+        <w:rPr>
+          <w:sz w:val="24"/>
+        </w:rPr>
+        <w:t>. No questioned costs are included in this single audit report. Treasury has made the following determinations regarding the audit finding and CAP listed below:</w:t>
       </w:r>
     </w:p>
     <w:p>
@@ -509,12 +309,12 @@
           <w:szCs w:val="24"/>
         </w:rPr>
       </w:pPr>
+      <w:commentRangeStart w:id="20"/>
       <w:commentRangeStart w:id="21"/>
       <w:commentRangeStart w:id="22"/>
-      <w:commentRangeStart w:id="23"/>
+      <w:commentRangeEnd w:id="20"/>
       <w:commentRangeEnd w:id="21"/>
       <w:commentRangeEnd w:id="22"/>
-      <w:commentRangeEnd w:id="23"/>
       <w:r>
         <w:rPr>
           <w:b/>
@@ -534,24 +334,6 @@
         </w:rPr>
         <w:t>21.027 / State and Local Fiscal Recovery Funds (SLFRF)</w:t>
       </w:r>
-    </w:p>
-    <w:p>
-      <w:pPr>
-        <w:spacing w:before="1" w:after="3" w:line="232" w:lineRule="auto"/>
-        <w:rPr>
-          <w:sz w:val="24"/>
-          <w:szCs w:val="24"/>
-        </w:rPr>
-      </w:pPr>
-    </w:p>
-    <w:p>
-      <w:pPr>
-        <w:spacing w:before="1" w:after="3" w:line="232" w:lineRule="auto"/>
-        <w:rPr>
-          <w:sz w:val="24"/>
-          <w:szCs w:val="24"/>
-        </w:rPr>
-      </w:pPr>
     </w:p>
     <w:p>
       <w:pPr>
@@ -564,16 +346,24 @@
     </w:p>
     <w:tbl>
       <w:tblPr>
-        <w:tblW w:type="auto" w:w="0"/>
+        <w:tblW w:type="dxa" w:w="9000"/>
         <w:tblLook w:firstColumn="1" w:firstRow="1" w:lastColumn="0" w:lastRow="0" w:noHBand="0" w:noVBand="1" w:val="04A0"/>
         <w:tblBorders>
-          <w:top w:val="single" w:sz="6" w:space="0" w:color="auto"/>
-          <w:left w:val="single" w:sz="6" w:space="0" w:color="auto"/>
-          <w:bottom w:val="single" w:sz="6" w:space="0" w:color="auto"/>
-          <w:right w:val="single" w:sz="6" w:space="0" w:color="auto"/>
-          <w:insideH w:val="single" w:sz="6" w:space="0" w:color="auto"/>
-          <w:insideV w:val="single" w:sz="6" w:space="0" w:color="auto"/>
+          <w:top w:val="single" w:sz="12" w:space="0" w:color="000000"/>
+          <w:left w:val="single" w:sz="12" w:space="0" w:color="000000"/>
+          <w:bottom w:val="single" w:sz="12" w:space="0" w:color="000000"/>
+          <w:right w:val="single" w:sz="12" w:space="0" w:color="000000"/>
+          <w:insideH w:val="single" w:sz="12" w:space="0" w:color="000000"/>
+          <w:insideV w:val="single" w:sz="12" w:space="0" w:color="000000"/>
         </w:tblBorders>
+        <w:tblLayout w:type="fixed"/>
+        <w:tblCellMar>
+          <w:top w:w="0" w:type="dxa"/>
+          <w:bottom w:w="0" w:type="dxa"/>
+          <w:left w:w="86" w:type="dxa"/>
+          <w:right w:w="86" w:type="dxa"/>
+        </w:tblCellMar>
+        <w:tblInd w:type="dxa" w:w="72"/>
       </w:tblPr>
       <w:tblGrid>
         <w:gridCol w:w="1872"/>
@@ -583,15 +373,17 @@
         <w:gridCol w:w="1872"/>
       </w:tblGrid>
       <w:tr>
+        <w:trPr>
+          <w:trHeight w:val="706" w:hRule="atLeast"/>
+        </w:trPr>
         <w:tc>
           <w:tcPr>
-            <w:tcW w:type="dxa" w:w="1872"/>
-            <w:shd w:fill="E7E6E6"/>
+            <w:tcW w:type="dxa" w:w="1195"/>
             <w:vAlign w:val="top"/>
           </w:tcPr>
           <w:p>
             <w:pPr>
-              <w:spacing w:before="0" w:after="0" w:line="240" w:lineRule="auto"/>
+              <w:spacing w:before="76" w:after="0" w:line="240" w:lineRule="auto"/>
               <w:jc w:val="center"/>
             </w:pPr>
             <w:r>
@@ -607,13 +399,12 @@
         </w:tc>
         <w:tc>
           <w:tcPr>
-            <w:tcW w:type="dxa" w:w="1872"/>
-            <w:shd w:fill="E7E6E6"/>
+            <w:tcW w:type="dxa" w:w="2290"/>
             <w:vAlign w:val="top"/>
           </w:tcPr>
           <w:p>
             <w:pPr>
-              <w:spacing w:before="0" w:after="0" w:line="240" w:lineRule="auto"/>
+              <w:spacing w:before="76" w:after="0" w:line="240" w:lineRule="auto"/>
               <w:jc w:val="center"/>
             </w:pPr>
             <w:r>
@@ -629,13 +420,12 @@
         </w:tc>
         <w:tc>
           <w:tcPr>
-            <w:tcW w:type="dxa" w:w="1872"/>
-            <w:shd w:fill="E7E6E6"/>
+            <w:tcW w:type="dxa" w:w="1728"/>
             <w:vAlign w:val="top"/>
           </w:tcPr>
           <w:p>
             <w:pPr>
-              <w:spacing w:before="0" w:after="0" w:line="240" w:lineRule="auto"/>
+              <w:spacing w:before="76" w:after="0" w:line="240" w:lineRule="auto"/>
               <w:jc w:val="center"/>
             </w:pPr>
             <w:r>
@@ -651,13 +441,12 @@
         </w:tc>
         <w:tc>
           <w:tcPr>
-            <w:tcW w:type="dxa" w:w="1872"/>
-            <w:shd w:fill="E7E6E6"/>
+            <w:tcW w:type="dxa" w:w="2074"/>
             <w:vAlign w:val="top"/>
           </w:tcPr>
           <w:p>
             <w:pPr>
-              <w:spacing w:before="0" w:after="0" w:line="240" w:lineRule="auto"/>
+              <w:spacing w:before="76" w:after="0" w:line="240" w:lineRule="auto"/>
               <w:jc w:val="center"/>
             </w:pPr>
             <w:r>
@@ -673,13 +462,12 @@
         </w:tc>
         <w:tc>
           <w:tcPr>
-            <w:tcW w:type="dxa" w:w="1872"/>
-            <w:shd w:fill="E7E6E6"/>
+            <w:tcW w:type="dxa" w:w="1714"/>
             <w:vAlign w:val="top"/>
           </w:tcPr>
           <w:p>
             <w:pPr>
-              <w:spacing w:before="0" w:after="0" w:line="240" w:lineRule="auto"/>
+              <w:spacing w:before="76" w:after="0" w:line="240" w:lineRule="auto"/>
               <w:jc w:val="center"/>
             </w:pPr>
             <w:r>
@@ -695,14 +483,17 @@
         </w:tc>
       </w:tr>
       <w:tr>
+        <w:trPr>
+          <w:trHeight w:val="706" w:hRule="atLeast"/>
+        </w:trPr>
         <w:tc>
           <w:tcPr>
-            <w:tcW w:type="dxa" w:w="1872"/>
+            <w:tcW w:type="dxa" w:w="1195"/>
             <w:vAlign w:val="top"/>
           </w:tcPr>
           <w:p>
             <w:pPr>
-              <w:spacing w:before="0" w:after="0" w:line="240" w:lineRule="auto"/>
+              <w:spacing w:before="200"/>
               <w:jc w:val="center"/>
             </w:pPr>
             <w:r>
@@ -715,12 +506,12 @@
         </w:tc>
         <w:tc>
           <w:tcPr>
-            <w:tcW w:type="dxa" w:w="1872"/>
+            <w:tcW w:type="dxa" w:w="2290"/>
             <w:vAlign w:val="top"/>
           </w:tcPr>
           <w:p>
             <w:pPr>
-              <w:spacing w:before="0" w:after="0" w:line="240" w:lineRule="auto"/>
+              <w:spacing w:before="0"/>
               <w:jc w:val="left"/>
             </w:pPr>
             <w:r>
@@ -746,18 +537,24 @@
               <w:rPr>
                 <w:sz w:val="24"/>
               </w:rPr>
+              <w:br/>
+            </w:r>
+            <w:r>
+              <w:rPr>
+                <w:sz w:val="24"/>
+              </w:rPr>
               <w:t>Failure to include required provisions in subawards supported with federal funds</w:t>
             </w:r>
           </w:p>
         </w:tc>
         <w:tc>
           <w:tcPr>
-            <w:tcW w:type="dxa" w:w="1872"/>
+            <w:tcW w:type="dxa" w:w="1728"/>
             <w:vAlign w:val="top"/>
           </w:tcPr>
           <w:p>
             <w:pPr>
-              <w:spacing w:before="0" w:after="0" w:line="240" w:lineRule="auto"/>
+              <w:spacing w:before="200"/>
               <w:jc w:val="center"/>
             </w:pPr>
             <w:r>
@@ -770,12 +567,12 @@
         </w:tc>
         <w:tc>
           <w:tcPr>
-            <w:tcW w:type="dxa" w:w="1872"/>
+            <w:tcW w:type="dxa" w:w="2074"/>
             <w:vAlign w:val="top"/>
           </w:tcPr>
           <w:p>
             <w:pPr>
-              <w:spacing w:before="0" w:after="0" w:line="240" w:lineRule="auto"/>
+              <w:spacing w:before="76" w:after="0"/>
               <w:jc w:val="center"/>
             </w:pPr>
             <w:r>
@@ -783,23 +580,53 @@
                 <w:sz w:val="24"/>
               </w:rPr>
               <w:t>Questioned Cost:</w:t>
-              <w:br/>
+            </w:r>
+          </w:p>
+          <w:p>
+            <w:pPr>
+              <w:spacing w:before="76" w:after="0"/>
+              <w:jc w:val="center"/>
+            </w:pPr>
+            <w:r>
+              <w:rPr>
+                <w:sz w:val="24"/>
+              </w:rPr>
               <w:t>None</w:t>
-              <w:br/>
+            </w:r>
+          </w:p>
+          <w:p>
+            <w:pPr>
+              <w:spacing w:before="76" w:after="0"/>
+              <w:jc w:val="center"/>
+            </w:pPr>
+            <w:r>
+              <w:rPr>
+                <w:sz w:val="24"/>
+              </w:rPr>
               <w:t>Disallowed Cost:</w:t>
-              <w:br/>
+            </w:r>
+          </w:p>
+          <w:p>
+            <w:pPr>
+              <w:spacing w:before="76" w:after="240"/>
+              <w:jc w:val="center"/>
+            </w:pPr>
+            <w:r>
+              <w:rPr>
+                <w:sz w:val="24"/>
+              </w:rPr>
               <w:t>None</w:t>
             </w:r>
           </w:p>
         </w:tc>
         <w:tc>
           <w:tcPr>
-            <w:tcW w:type="dxa" w:w="1872"/>
+            <w:tcW w:type="dxa" w:w="1714"/>
             <w:vAlign w:val="top"/>
           </w:tcPr>
           <w:p>
             <w:pPr>
-              <w:spacing w:before="0" w:after="0" w:line="240" w:lineRule="auto"/>
+              <w:spacing w:before="200"/>
               <w:jc w:val="center"/>
             </w:pPr>
             <w:r>
@@ -823,16 +650,7 @@
           <w:szCs w:val="24"/>
         </w:rPr>
       </w:pPr>
-      <w:bookmarkStart w:id="24" w:name="_Hlk154663631"/>
-      <w:r>
-        <w:rPr>
-          <w:caps w:val="0"/>
-          <w:smallCaps w:val="0"/>
-          <w:sz w:val="24"/>
-          <w:szCs w:val="24"/>
-        </w:rPr>
-        <w:br w:type="textWrapping" w:clear="all"/>
-      </w:r>
+      <w:bookmarkStart w:id="23" w:name="_Hlk154663631"/>
     </w:p>
     <w:p>
       <w:pPr>
@@ -844,16 +662,16 @@
           <w:szCs w:val="24"/>
         </w:rPr>
       </w:pPr>
-      <w:commentRangeStart w:id="25"/>
-      <w:bookmarkStart w:id="26" w:name="_Hlk172811021"/>
-      <w:r>
-        <w:rPr>
-          <w:sz w:val="24"/>
-        </w:rPr>
-        <w:t xml:space="preserve">The audit finding(s)  sustained as the identified issue(s) violate(s) the terms and conditions of the above-referenced award(s). The CAP(s), if implemented,  responsive to the audit finding(s), address(es) the cause of the audit finding(s) and should be completed in accordance with the action date(s) indicated in the single audit report.     </w:t>
-      </w:r>
-    </w:p>
-    <w:bookmarkEnd w:id="26"/>
+      <w:commentRangeStart w:id="24"/>
+      <w:bookmarkStart w:id="25" w:name="_Hlk172811021"/>
+      <w:r>
+        <w:rPr>
+          <w:sz w:val="24"/>
+        </w:rPr>
+        <w:t xml:space="preserve">The audit finding is sustained as the identified issue violates the terms and conditions of the above-referenced award. The CAP, if implemented, is responsive to the audit finding, addresses the cause of the audit finding and should be completed in accordance with the action date indicated in the single audit report. </w:t>
+      </w:r>
+    </w:p>
+    <w:bookmarkEnd w:id="25"/>
     <w:p>
       <w:pPr>
         <w:pStyle w:val="BodyText"/>
@@ -876,16 +694,14 @@
           <w:szCs w:val="24"/>
         </w:rPr>
       </w:pPr>
-      <w:proofErr w:type="gramStart"/>
-      <w:proofErr w:type="gramEnd"/>
-      <w:bookmarkStart w:id="27" w:name="_Hlk154663714"/>
-      <w:bookmarkEnd w:id="24"/>
-      <w:commentRangeEnd w:id="25"/>
-      <w:r>
-        <w:rPr>
-          <w:sz w:val="24"/>
-        </w:rPr>
-        <w:t xml:space="preserve">Please note, the corrective action(s)  subject to review during this recipient’s next annual single audit or program-specific audit, as applicable, to determine adequacy. If the same audit finding(s) appear(s) in a future single audit report for this recipient, its current or future award funding under Treasury’s programs may be adversely impacted. </w:t>
+      <w:bookmarkStart w:id="26" w:name="_Hlk154663714"/>
+      <w:bookmarkEnd w:id="23"/>
+      <w:commentRangeEnd w:id="24"/>
+      <w:r>
+        <w:rPr>
+          <w:sz w:val="24"/>
+        </w:rPr>
+        <w:t xml:space="preserve">Please note, the corrective action is subject to review during this recipient’s next annual single audit or program-specific audit, as applicable, to determine adequacy. If the same audit finding appears in a future single audit report for this recipient, its current or future award funding under Treasury’s programs may be adversely impacted. </w:t>
       </w:r>
     </w:p>
     <w:p>
@@ -908,21 +724,30 @@
           <w:szCs w:val="24"/>
         </w:rPr>
       </w:pPr>
-      <w:commentRangeStart w:id="28"/>
-      <w:commentRangeStart w:id="29"/>
-      <w:commentRangeEnd w:id="28"/>
-      <w:commentRangeEnd w:id="29"/>
-      <w:proofErr w:type="spellStart"/>
-      <w:proofErr w:type="spellEnd"/>
-      <w:proofErr w:type="gramStart"/>
-      <w:proofErr w:type="gramEnd"/>
-      <w:r>
-        <w:rPr>
-          <w:caps w:val="0"/>
-          <w:smallCaps w:val="0"/>
-          <w:sz w:val="24"/>
-        </w:rPr>
-        <w:t>The City Of Decatur may appeal Treasury’s decision for the audit finding(s) listed above. A written appeal must be submitted within 30 calendar days of the date of this management decision letter to Treasury via email at  ORP_SingleAudits@treasury.gov  . The appeal must include: 1) the specific reasons for disputing Treasury’s determination; 2) relevant documentation to support the recipient’s position; 3) an alternative course of action with an anticipated completion date of the action; and 4) the contact information of the managing official responsible for implementing the proposed alternative course of action.</w:t>
+      <w:commentRangeStart w:id="27"/>
+      <w:commentRangeEnd w:id="27"/>
+      <w:r>
+        <w:rPr>
+          <w:sz w:val="24"/>
+        </w:rPr>
+        <w:t xml:space="preserve">City of Decatur may appeal Treasury’s decision for the audit finding listed above. A written appeal must be submitted within 30 calendar days of the date of this management decision letter to Treasury via email at </w:t>
+      </w:r>
+      <w:hyperlink r:id="rId24">
+        <w:r>
+          <w:rPr>
+            <w:color w:val="0000FF"/>
+            <w:u w:val="single"/>
+            <w:sz w:val="24"/>
+            <w:szCs w:val="24"/>
+          </w:rPr>
+          <w:t>ORP_SingleAudits@treasury.gov</w:t>
+        </w:r>
+      </w:hyperlink>
+      <w:r>
+        <w:rPr>
+          <w:sz w:val="24"/>
+        </w:rPr>
+        <w:t>. The appeal must include: 1) the specific reasons for disputing Treasury’s determination; 2) relevant documentation to support the recipient’s position; 3) an alternative course of action with an anticipated completion date of the action; and 4) the contact information of the managing official responsible for implementing the proposed alternative course of action.</w:t>
       </w:r>
     </w:p>
     <w:p>
@@ -935,7 +760,7 @@
           <w:szCs w:val="24"/>
         </w:rPr>
       </w:pPr>
-      <w:bookmarkStart w:id="30" w:name="_Hlk172811103"/>
+      <w:bookmarkStart w:id="28" w:name="_Hlk172811103"/>
     </w:p>
     <w:p>
       <w:pPr>
@@ -947,22 +772,31 @@
           <w:szCs w:val="24"/>
         </w:rPr>
       </w:pPr>
-      <w:proofErr w:type="gramStart"/>
-      <w:proofErr w:type="gramEnd"/>
-      <w:proofErr w:type="spellStart"/>
-      <w:proofErr w:type="spellEnd"/>
-      <w:proofErr w:type="gramStart"/>
-      <w:proofErr w:type="gramEnd"/>
-      <w:r>
-        <w:rPr>
-          <w:caps w:val="0"/>
-          <w:smallCaps w:val="0"/>
-          <w:sz w:val="24"/>
-        </w:rPr>
-        <w:t>For questions regarding the audit finding(s), please email us at  ORP_SingleAudits@treasury.gov  . Thank you.</w:t>
-      </w:r>
-    </w:p>
-    <w:bookmarkEnd w:id="30"/>
+      <w:r>
+        <w:rPr>
+          <w:sz w:val="24"/>
+        </w:rPr>
+        <w:t xml:space="preserve">For questions regarding the audit finding, please email us at </w:t>
+      </w:r>
+      <w:hyperlink r:id="rId24">
+        <w:r>
+          <w:rPr>
+            <w:color w:val="0000FF"/>
+            <w:u w:val="single"/>
+            <w:sz w:val="24"/>
+            <w:szCs w:val="24"/>
+          </w:rPr>
+          <w:t>ORP_SingleAudits@treasury.gov</w:t>
+        </w:r>
+      </w:hyperlink>
+      <w:r>
+        <w:rPr>
+          <w:sz w:val="24"/>
+        </w:rPr>
+        <w:t>. Thank you.</w:t>
+      </w:r>
+    </w:p>
+    <w:bookmarkEnd w:id="28"/>
     <w:p>
       <w:pPr>
         <w:pStyle w:val="BodyText"/>
@@ -1226,7 +1060,7 @@
         <w:t xml:space="preserve">Treasury </w:t>
       </w:r>
     </w:p>
-    <w:bookmarkEnd w:id="27"/>
+    <w:bookmarkEnd w:id="26"/>
     <w:p>
       <w:pPr>
         <w:pStyle w:val="BodyText"/>
@@ -1512,7 +1346,7 @@
       </w:r>
     </w:p>
   </w:comment>
-  <w:comment w:id="16" w:author="Anthony D'Alessandro" w:date="2025-09-08T11:19:00Z" w:initials="AD">
+  <w:comment w:id="16" w:author="Anthony D'Alessandro" w:date="2025-09-08T11:20:00Z" w:initials="AD">
     <w:p>
       <w:pPr>
         <w:pStyle w:val="CommentText"/>
@@ -1524,11 +1358,17 @@
         <w:annotationRef/>
       </w:r>
       <w:r>
-        <w:t>Must add “The” before recipient name</w:t>
+        <w:t>Need full name as written in SF-SAC [auditee_name] “</w:t>
+      </w:r>
+      <w:r>
+        <w:rPr>
+          <w:color w:val="000000"/>
+        </w:rPr>
+        <w:t>CITY OF ANN ARBOR, MICHIGAN”</w:t>
       </w:r>
     </w:p>
   </w:comment>
-  <w:comment w:id="17" w:author="Anthony D'Alessandro" w:date="2025-09-08T11:20:00Z" w:initials="AD">
+  <w:comment w:id="18" w:author="Anthony D'Alessandro" w:date="2025-09-08T11:30:00Z" w:initials="AD">
     <w:p>
       <w:pPr>
         <w:pStyle w:val="CommentText"/>
@@ -1540,17 +1380,11 @@
         <w:annotationRef/>
       </w:r>
       <w:r>
-        <w:t>Need full name as written in SF-SAC [auditee_name] “</w:t>
-      </w:r>
-      <w:r>
-        <w:rPr>
-          <w:color w:val="000000"/>
-        </w:rPr>
-        <w:t>CITY OF ANN ARBOR, MICHIGAN”</w:t>
+        <w:t>Add S if plural, remove if singular finding</w:t>
       </w:r>
     </w:p>
   </w:comment>
-  <w:comment w:id="19" w:author="Anthony D'Alessandro" w:date="2025-09-08T11:30:00Z" w:initials="AD">
+  <w:comment w:id="19" w:author="Anthony D'Alessandro" w:date="2025-09-08T13:29:00Z" w:initials="AD">
     <w:p>
       <w:pPr>
         <w:pStyle w:val="CommentText"/>
@@ -1562,27 +1396,11 @@
         <w:annotationRef/>
       </w:r>
       <w:r>
-        <w:t>Add S if plural, remove if singular finding</w:t>
+        <w:t>No plural in this example</w:t>
       </w:r>
     </w:p>
   </w:comment>
-  <w:comment w:id="20" w:author="Anthony D'Alessandro" w:date="2025-09-08T13:29:00Z" w:initials="AD">
-    <w:p>
-      <w:pPr>
-        <w:pStyle w:val="CommentText"/>
-      </w:pPr>
-      <w:r>
-        <w:rPr>
-          <w:rStyle w:val="CommentReference"/>
-        </w:rPr>
-        <w:annotationRef/>
-      </w:r>
-      <w:r>
-        <w:t>No plural in this example</w:t>
-      </w:r>
-    </w:p>
-  </w:comment>
-  <w:comment w:id="21" w:author="Jones, Jasmine" w:date="2024-07-26T14:49:00Z" w:initials="JJ">
+  <w:comment w:id="20" w:author="Jones, Jasmine" w:date="2024-07-26T14:49:00Z" w:initials="JJ">
     <w:p>
       <w:pPr>
         <w:pStyle w:val="CommentText"/>
@@ -1677,7 +1495,7 @@
       </w:r>
     </w:p>
   </w:comment>
-  <w:comment w:id="22" w:author="Anthony D'Alessandro" w:date="2025-09-08T14:22:00Z" w:initials="AD">
+  <w:comment w:id="21" w:author="Anthony D'Alessandro" w:date="2025-09-08T14:22:00Z" w:initials="AD">
     <w:p>
       <w:pPr>
         <w:pStyle w:val="CommentText"/>
@@ -1693,7 +1511,7 @@
       </w:r>
     </w:p>
   </w:comment>
-  <w:comment w:id="23" w:author="Anthony D'Alessandro" w:date="2025-09-08T15:17:00Z" w:initials="AD">
+  <w:comment w:id="22" w:author="Anthony D'Alessandro" w:date="2025-09-08T15:17:00Z" w:initials="AD">
     <w:p>
       <w:pPr>
         <w:pStyle w:val="CommentText"/>
@@ -1709,7 +1527,7 @@
       </w:r>
     </w:p>
   </w:comment>
-  <w:comment w:id="25" w:author="Anthony D'Alessandro" w:date="2025-09-08T14:18:00Z" w:initials="AD">
+  <w:comment w:id="24" w:author="Anthony D'Alessandro" w:date="2025-09-08T14:18:00Z" w:initials="AD">
     <w:p>
       <w:pPr>
         <w:pStyle w:val="CommentText"/>
@@ -1725,23 +1543,7 @@
       </w:r>
     </w:p>
   </w:comment>
-  <w:comment w:id="28" w:author="Anthony D'Alessandro" w:date="2025-09-08T14:20:00Z" w:initials="AD">
-    <w:p>
-      <w:pPr>
-        <w:pStyle w:val="CommentText"/>
-      </w:pPr>
-      <w:r>
-        <w:rPr>
-          <w:rStyle w:val="CommentReference"/>
-        </w:rPr>
-        <w:annotationRef/>
-      </w:r>
-      <w:r>
-        <w:t>Insert ‘The’ before any auditee name</w:t>
-      </w:r>
-    </w:p>
-  </w:comment>
-  <w:comment w:id="29" w:author="Anthony D'Alessandro" w:date="2025-09-08T14:20:00Z" w:initials="AD">
+  <w:comment w:id="27" w:author="Anthony D'Alessandro" w:date="2025-09-08T14:20:00Z" w:initials="AD">
     <w:p>
       <w:pPr>
         <w:pStyle w:val="CommentText"/>
@@ -1783,7 +1585,6 @@
   <w15:commentEx w15:paraId="106C798F" w15:done="0"/>
   <w15:commentEx w15:paraId="39797E7D" w15:paraIdParent="106C798F" w15:done="0"/>
   <w15:commentEx w15:paraId="02B6DC6A" w15:paraIdParent="106C798F" w15:done="0"/>
-  <w15:commentEx w15:paraId="1E8E3193" w15:done="0"/>
   <w15:commentEx w15:paraId="0AA7958F" w15:done="0"/>
   <w15:commentEx w15:paraId="43DE5A9E" w15:done="0"/>
   <w15:commentEx w15:paraId="16C20D1E" w15:paraIdParent="43DE5A9E" w15:done="0"/>
@@ -1791,7 +1592,6 @@
   <w15:commentEx w15:paraId="6578FE08" w15:done="0"/>
   <w15:commentEx w15:paraId="69E6AEA2" w15:paraIdParent="6578FE08" w15:done="0"/>
   <w15:commentEx w15:paraId="4280349F" w15:done="0"/>
-  <w15:commentEx w15:paraId="1CC50EE1" w15:done="0"/>
   <w15:commentEx w15:paraId="2CB10DBE" w15:done="0"/>
 </w15:commentsEx>
 </file>
@@ -1813,7 +1613,6 @@
   <w16cex:commentExtensible w16cex:durableId="70C9BCE0" w16cex:dateUtc="2025-09-08T15:12:00Z"/>
   <w16cex:commentExtensible w16cex:durableId="7048A7A0" w16cex:dateUtc="2025-09-08T15:17:00Z"/>
   <w16cex:commentExtensible w16cex:durableId="1696BE24" w16cex:dateUtc="2025-09-08T15:21:00Z"/>
-  <w16cex:commentExtensible w16cex:durableId="405864F6" w16cex:dateUtc="2025-09-08T15:19:00Z"/>
   <w16cex:commentExtensible w16cex:durableId="1BFAB22C" w16cex:dateUtc="2025-09-08T15:20:00Z"/>
   <w16cex:commentExtensible w16cex:durableId="3EC27938" w16cex:dateUtc="2025-09-08T15:30:00Z"/>
   <w16cex:commentExtensible w16cex:durableId="6A1394DD" w16cex:dateUtc="2025-09-08T17:29:00Z"/>
@@ -1821,7 +1620,6 @@
   <w16cex:commentExtensible w16cex:durableId="1F07D09F" w16cex:dateUtc="2025-09-08T18:22:00Z"/>
   <w16cex:commentExtensible w16cex:durableId="2A5D9E25" w16cex:dateUtc="2025-09-08T19:17:00Z"/>
   <w16cex:commentExtensible w16cex:durableId="309700CA" w16cex:dateUtc="2025-09-08T18:18:00Z"/>
-  <w16cex:commentExtensible w16cex:durableId="60E2678C" w16cex:dateUtc="2025-09-08T18:20:00Z"/>
   <w16cex:commentExtensible w16cex:durableId="57F520C3" w16cex:dateUtc="2025-09-08T18:20:00Z"/>
 </w16cex:commentsExtensible>
 </file>
@@ -1843,7 +1641,6 @@
   <w16cid:commentId w16cid:paraId="106C798F" w16cid:durableId="70C9BCE0"/>
   <w16cid:commentId w16cid:paraId="39797E7D" w16cid:durableId="7048A7A0"/>
   <w16cid:commentId w16cid:paraId="02B6DC6A" w16cid:durableId="1696BE24"/>
-  <w16cid:commentId w16cid:paraId="1E8E3193" w16cid:durableId="405864F6"/>
   <w16cid:commentId w16cid:paraId="0AA7958F" w16cid:durableId="1BFAB22C"/>
   <w16cid:commentId w16cid:paraId="43DE5A9E" w16cid:durableId="3EC27938"/>
   <w16cid:commentId w16cid:paraId="16C20D1E" w16cid:durableId="6A1394DD"/>
@@ -1851,7 +1648,6 @@
   <w16cid:commentId w16cid:paraId="6578FE08" w16cid:durableId="1F07D09F"/>
   <w16cid:commentId w16cid:paraId="69E6AEA2" w16cid:durableId="2A5D9E25"/>
   <w16cid:commentId w16cid:paraId="4280349F" w16cid:durableId="309700CA"/>
-  <w16cid:commentId w16cid:paraId="1CC50EE1" w16cid:durableId="60E2678C"/>
   <w16cid:commentId w16cid:paraId="2CB10DBE" w16cid:durableId="57F520C3"/>
 </w16cid:commentsIds>
 </file>
@@ -2039,7 +1835,7 @@
           <v:imagedata r:id="rId1" o:title=""/>
           <w10:wrap anchorx="page" anchory="page"/>
         </v:shape>
-        <o:OLEObject Type="Embed" ProgID="Word.Picture.8" ShapeID="_x0000_s1026" DrawAspect="Content" ObjectID="_1829385731" r:id="rId2"/>
+        <o:OLEObject Type="Embed" ProgID="Word.Picture.8" ShapeID="_x0000_s1026" DrawAspect="Content" ObjectID="_1834117168" r:id="rId2"/>
       </w:object>
     </w:r>
     <w:r>
@@ -3773,15 +3569,6 @@
 </file>
 
 <file path=customXml/item2.xml><?xml version="1.0" encoding="utf-8"?>
-<?mso-contentType ?>
-<FormTemplates xmlns="http://schemas.microsoft.com/sharepoint/v3/contenttype/forms">
-  <Display>DocumentLibraryForm</Display>
-  <Edit>DocumentLibraryForm</Edit>
-  <New>DocumentLibraryForm</New>
-</FormTemplates>
-</file>
-
-<file path=customXml/item3.xml><?xml version="1.0" encoding="utf-8"?>
 <ct:contentTypeSchema xmlns:ct="http://schemas.microsoft.com/office/2006/metadata/contentType" xmlns:ma="http://schemas.microsoft.com/office/2006/metadata/properties/metaAttributes" ct:_="" ma:_="" ma:contentTypeName="Document" ma:contentTypeID="0x010100F126565443E1F344BFAEE422504F4339" ma:contentTypeVersion="0" ma:contentTypeDescription="Create a new document." ma:contentTypeScope="" ma:versionID="492a193985b7199b3960d0605ff30ce1">
   <xsd:schema xmlns:xsd="http://www.w3.org/2001/XMLSchema" xmlns:xs="http://www.w3.org/2001/XMLSchema" xmlns:p="http://schemas.microsoft.com/office/2006/metadata/properties" targetNamespace="http://schemas.microsoft.com/office/2006/metadata/properties" ma:root="true" ma:fieldsID="b764bea3eb9b1a5be8fd57fac5fb459b">
     <xsd:element name="properties">
@@ -3895,6 +3682,15 @@
 </ct:contentTypeSchema>
 </file>
 
+<file path=customXml/item3.xml><?xml version="1.0" encoding="utf-8"?>
+<?mso-contentType ?>
+<FormTemplates xmlns="http://schemas.microsoft.com/sharepoint/v3/contenttype/forms">
+  <Display>DocumentLibraryForm</Display>
+  <Edit>DocumentLibraryForm</Edit>
+  <New>DocumentLibraryForm</New>
+</FormTemplates>
+</file>
+
 <file path=customXml/itemProps1.xml><?xml version="1.0" encoding="utf-8"?>
 <ds:datastoreItem xmlns:ds="http://schemas.openxmlformats.org/officeDocument/2006/customXml" ds:itemID="{A5BE170D-67CC-493F-80F6-03FCA15C5893}">
   <ds:schemaRefs>
@@ -3911,14 +3707,6 @@
 </file>
 
 <file path=customXml/itemProps2.xml><?xml version="1.0" encoding="utf-8"?>
-<ds:datastoreItem xmlns:ds="http://schemas.openxmlformats.org/officeDocument/2006/customXml" ds:itemID="{2123481F-583C-4491-8BD7-A223B6902F04}">
-  <ds:schemaRefs>
-    <ds:schemaRef ds:uri="http://schemas.microsoft.com/sharepoint/v3/contenttype/forms"/>
-  </ds:schemaRefs>
-</ds:datastoreItem>
-</file>
-
-<file path=customXml/itemProps3.xml><?xml version="1.0" encoding="utf-8"?>
 <ds:datastoreItem xmlns:ds="http://schemas.openxmlformats.org/officeDocument/2006/customXml" ds:itemID="{01DF460B-8754-4B34-B61F-D5EF1A2120E9}">
   <ds:schemaRefs>
     <ds:schemaRef ds:uri="http://schemas.microsoft.com/office/2006/metadata/contentType"/>
@@ -3932,4 +3720,12 @@
     <ds:schemaRef ds:uri="http://schemas.microsoft.com/office/infopath/2007/PartnerControls"/>
   </ds:schemaRefs>
 </ds:datastoreItem>
+</file>
+
+<file path=customXml/itemProps3.xml><?xml version="1.0" encoding="utf-8"?>
+<ds:datastoreItem xmlns:ds="http://schemas.openxmlformats.org/officeDocument/2006/customXml" ds:itemID="{2123481F-583C-4491-8BD7-A223B6902F04}">
+  <ds:schemaRefs>
+    <ds:schemaRef ds:uri="http://schemas.microsoft.com/sharepoint/v3/contenttype/forms"/>
+  </ds:schemaRefs>
+</ds:datastoreItem>
 </file>
</xml_diff>

<commit_message>
Added more treasury ALN filters
</commit_message>
<xml_diff>
--- a/_out/mdl/2023/MDL-CITY_OF_DECATUR-376001308-2023.docx
+++ b/_out/mdl/2023/MDL-CITY_OF_DECATUR-376001308-2023.docx
@@ -33,7 +33,7 @@
           <w:smallCaps w:val="0"/>
           <w:sz w:val="24"/>
         </w:rPr>
-        <w:t>March 09, 2026</w:t>
+        <w:t>March 11, 2026</w:t>
       </w:r>
     </w:p>
     <w:p>
@@ -266,13 +266,25 @@
           <w:b/>
           <w:sz w:val="24"/>
         </w:rPr>
-        <w:t>City of Decatur</w:t>
-      </w:r>
-      <w:r>
-        <w:rPr>
-          <w:sz w:val="24"/>
-        </w:rPr>
-        <w:t xml:space="preserve"> prepared by Sikich CPA LLC for the fiscal year ending on </w:t>
+        <w:t>The City of Decatur</w:t>
+      </w:r>
+      <w:r>
+        <w:rPr>
+          <w:sz w:val="24"/>
+        </w:rPr>
+        <w:t xml:space="preserve"> prepared by </w:t>
+      </w:r>
+      <w:r>
+        <w:rPr>
+          <w:sz w:val="24"/>
+        </w:rPr>
+        <w:t>Sikich CPA LLC</w:t>
+      </w:r>
+      <w:r>
+        <w:rPr>
+          <w:sz w:val="24"/>
+        </w:rPr>
+        <w:t xml:space="preserve"> for the fiscal year ending on </w:t>
       </w:r>
       <w:r>
         <w:rPr>
@@ -525,7 +537,7 @@
               <w:rPr>
                 <w:sz w:val="24"/>
               </w:rPr>
-              <w:t xml:space="preserve"> - </w:t>
+              <w:t xml:space="preserve"> –</w:t>
             </w:r>
             <w:r>
               <w:rPr>

</xml_diff>